<commit_message>
Local access rebrand: peso.com -> mptvi.com (URL + seeded logins)
The office reaches the app at http://mptvi.com/ now:
- Local URL/hostname changed across the vhost, setup.bat, client-hostname.bat,
  env template and the install/access docs (incl. the .docx sheets).
- Seeded staff logins move to @mptvi.com to match (admin@mptvi.com / password);
  SecurityPosture still flags the legacy @peso.com and @mptvi.test demo logins
  so any left over from earlier seeds are caught before go-live.

Only the LOCAL access name + demo logins change; the live VPS
(mptvi.adfirm.net) is unaffected. 188 tests green.

Co-Authored-By: Claude Opus 4.8 <noreply@anthropic.com>
</commit_message>
<xml_diff>
--- a/deploy/local/ACCESS-SHEET.docx
+++ b/deploy/local/ACCESS-SHEET.docx
@@ -46,7 +46,7 @@
         <w:ind w:left="280" w:hanging="280"/>
       </w:pPr>
       <w:r>
-        <w:t>•  On any office PC: open a web browser and go to http://peso.com/</w:t>
+        <w:t>•  On any office PC: open a web browser and go to http://mptvi.com/</w:t>
       </w:r>
     </w:p>
     <w:p>
@@ -55,7 +55,7 @@
         <w:ind w:left="280" w:hanging="280"/>
       </w:pPr>
       <w:r>
-        <w:t>•  On the server PC itself: http://peso.com/ or http://localhost/</w:t>
+        <w:t>•  On the server PC itself: http://mptvi.com/ or http://localhost/</w:t>
       </w:r>
     </w:p>
     <w:p>
@@ -64,7 +64,7 @@
         <w:ind w:left="280" w:hanging="280"/>
       </w:pPr>
       <w:r>
-        <w:t>•  A PC can only reach peso.com after client-hostname.bat has been run on it once (see the Monday install checklist).</w:t>
+        <w:t>•  A PC can only reach mptvi.com after client-hostname.bat has been run on it once (see the Monday install checklist).</w:t>
       </w:r>
     </w:p>
     <w:p>
@@ -209,7 +209,7 @@
               <w:rPr>
                 <w:sz w:val="20"/>
               </w:rPr>
-              <w:t>admin@peso.com</w:t>
+              <w:t>admin@mptvi.com</w:t>
             </w:r>
           </w:p>
         </w:tc>
@@ -270,7 +270,7 @@
               <w:rPr>
                 <w:sz w:val="20"/>
               </w:rPr>
-              <w:t>secretary@peso.com</w:t>
+              <w:t>secretary@mptvi.com</w:t>
             </w:r>
           </w:p>
         </w:tc>
@@ -329,7 +329,7 @@
               <w:rPr>
                 <w:sz w:val="20"/>
               </w:rPr>
-              <w:t>registrar@peso.com</w:t>
+              <w:t>registrar@mptvi.com</w:t>
             </w:r>
           </w:p>
         </w:tc>
@@ -390,7 +390,7 @@
               <w:rPr>
                 <w:sz w:val="20"/>
               </w:rPr>
-              <w:t>cashier@peso.com</w:t>
+              <w:t>cashier@mptvi.com</w:t>
             </w:r>
           </w:p>
         </w:tc>
@@ -449,7 +449,7 @@
               <w:rPr>
                 <w:sz w:val="20"/>
               </w:rPr>
-              <w:t>coordinator@peso.com</w:t>
+              <w:t>coordinator@mptvi.com</w:t>
             </w:r>
           </w:p>
         </w:tc>
@@ -559,7 +559,7 @@
         <w:ind w:left="320" w:hanging="320"/>
       </w:pPr>
       <w:r>
-        <w:t>1.  Sign in as admin@peso.com / password.</w:t>
+        <w:t>1.  Sign in as admin@mptvi.com / password.</w:t>
       </w:r>
     </w:p>
     <w:p>
@@ -586,7 +586,7 @@
         <w:ind w:left="320" w:hanging="320"/>
       </w:pPr>
       <w:r>
-        <w:t>4.  Delete any starter demo accounts you are not using (secretary@ / registrar@ / cashier@ / coordinator@peso.com).</w:t>
+        <w:t>4.  Delete any starter demo accounts you are not using (secretary@ / registrar@ / cashier@ / coordinator@mptvi.com).</w:t>
       </w:r>
     </w:p>
     <w:p>

</xml_diff>